<commit_message>
update so map saves to Figures
</commit_message>
<xml_diff>
--- a/Manuscript.docx
+++ b/Manuscript.docx
@@ -31,7 +31,7 @@
         <w:pStyle w:val="Author"/>
       </w:pPr>
       <w:r>
-        <w:t xml:space="preserve">Student</w:t>
+        <w:t xml:space="preserve">Nayan Shibu</w:t>
       </w:r>
     </w:p>
     <w:p>
@@ -261,13 +261,14 @@
       <w:r>
         <w:t xml:space="preserve">We used data collected at 31 NABat sites across British Columbia between May 23 to July 8 2025 (</w:t>
       </w:r>
-      <w:r>
-        <w:rPr>
-          <w:b/>
-          <w:bCs/>
-        </w:rPr>
-        <w:t xml:space="preserve">?@fig-map</w:t>
-      </w:r>
+      <w:hyperlink w:anchor="fig-map">
+        <w:r>
+          <w:rPr>
+            <w:rStyle w:val="Hyperlink"/>
+          </w:rPr>
+          <w:t xml:space="preserve">Figure 2</w:t>
+        </w:r>
+      </w:hyperlink>
       <w:r>
         <w:t xml:space="preserve">). Most sites were in southeastern and south-central BC, with a few in the north. At each site, we deployed two recorder types, a Wildlife Acoustics Song Meter SM2Bat+ (SM2) and a Titley Scientific Chorus (Chorus), following the NABat protocol and the provincial standards for British Columbia</w:t>
       </w:r>
@@ -382,6 +383,14 @@
         </w:tc>
       </w:tr>
     </w:tbl>
+    <w:p>
+      <w:pPr>
+        <w:pStyle w:val="BodyText"/>
+      </w:pPr>
+      <w:r>
+        <w:t xml:space="preserve"> </w:t>
+      </w:r>
+    </w:p>
     <w:tbl>
       <w:tblPr>
         <w:tblStyle w:val="Table"/>
@@ -395,7 +404,7 @@
       <w:tr>
         <w:tc>
           <w:tcPr/>
-          <w:bookmarkStart w:id="18" w:name="fig-sitemap"/>
+          <w:bookmarkStart w:id="18" w:name="fig-map"/>
           <w:p>
             <w:pPr>
               <w:pStyle w:val="Compact"/>
@@ -404,14 +413,14 @@
             <w:r>
               <w:drawing>
                 <wp:inline>
-                  <wp:extent cx="5334000" cy="5334000"/>
+                  <wp:extent cx="5334000" cy="4923692"/>
                   <wp:effectExtent b="0" l="0" r="0" t="0"/>
                   <wp:docPr descr="" title="" id="16" name="Picture"/>
                   <a:graphic>
                     <a:graphicData uri="http://schemas.openxmlformats.org/drawingml/2006/picture">
                       <pic:pic>
                         <pic:nvPicPr>
-                          <pic:cNvPr descr="Manuscript_files/figure-docx/fig-sitemap-1.png" id="17" name="Picture"/>
+                          <pic:cNvPr descr="Figures/fig_mapsites.png" id="17" name="Picture"/>
                           <pic:cNvPicPr>
                             <a:picLocks noChangeArrowheads="1" noChangeAspect="1"/>
                           </pic:cNvPicPr>
@@ -425,7 +434,7 @@
                         <pic:spPr bwMode="auto">
                           <a:xfrm>
                             <a:off x="0" y="0"/>
-                            <a:ext cx="5334000" cy="5334000"/>
+                            <a:ext cx="5334000" cy="4923692"/>
                           </a:xfrm>
                           <a:prstGeom prst="rect">
                             <a:avLst/>

</xml_diff>